<commit_message>
Artigo: capa, resumo e abstract em páginas próprias, sumário e cabeçalho
</commit_message>
<xml_diff>
--- a/revisao_2026/docs/Artigo_CoT_Versao_Final.docx
+++ b/revisao_2026/docs/Artigo_CoT_Versao_Final.docx
@@ -4,26 +4,149 @@
   <w:body>
     <w:p>
       <w:pPr>
+        <w:pStyle w:val="Capa"/>
+      </w:pPr>
+      <w:r>
+        <w:t xml:space="preserve">CENTRO UNIVERSITÁRIO ATENEU</w:t>
+      </w:r>
+    </w:p>
+    <w:p>
+      <w:pPr>
+        <w:pStyle w:val="Capa"/>
+      </w:pPr>
+      <w:r>
+        <w:t xml:space="preserve">ENGENHARIA DA COMPUTAÇÃO</w:t>
+      </w:r>
+    </w:p>
+    <w:p>
+      <w:pPr>
+        <w:pStyle w:val="BodyText"/>
+      </w:pPr>
+      <w:r>
+        <w:t xml:space="preserve"> </w:t>
+      </w:r>
+    </w:p>
+    <w:p>
+      <w:pPr>
+        <w:pStyle w:val="Capa"/>
+      </w:pPr>
+      <w:r>
+        <w:t xml:space="preserve">Kelvin e Silva Marques</w:t>
+      </w:r>
+    </w:p>
+    <w:p>
+      <w:pPr>
+        <w:pStyle w:val="Capa"/>
+      </w:pPr>
+      <w:r>
+        <w:t xml:space="preserve">Dimitri Farias Fernandes</w:t>
+      </w:r>
+    </w:p>
+    <w:p>
+      <w:pPr>
+        <w:pStyle w:val="Capa"/>
+      </w:pPr>
+      <w:r>
+        <w:t xml:space="preserve">Hastrorllabyo da Silva Lima</w:t>
+      </w:r>
+    </w:p>
+    <w:p>
+      <w:pPr>
+        <w:pStyle w:val="Capa"/>
+      </w:pPr>
+      <w:r>
+        <w:t xml:space="preserve">Keven dos Santos Xavier</w:t>
+      </w:r>
+    </w:p>
+    <w:p>
+      <w:pPr>
+        <w:pStyle w:val="Capa"/>
+      </w:pPr>
+      <w:r>
+        <w:t xml:space="preserve">Caio de Freitas Brandão</w:t>
+      </w:r>
+    </w:p>
+    <w:p>
+      <w:pPr>
+        <w:pStyle w:val="Capa"/>
+      </w:pPr>
+      <w:r>
+        <w:t xml:space="preserve">Kauan Magalhães Costa</w:t>
+      </w:r>
+    </w:p>
+    <w:p>
+      <w:pPr>
+        <w:pStyle w:val="Capa"/>
+      </w:pPr>
+      <w:r>
+        <w:t xml:space="preserve">Guilherme Martins Bezerra</w:t>
+      </w:r>
+    </w:p>
+    <w:p>
+      <w:pPr>
+        <w:pStyle w:val="Capa"/>
+      </w:pPr>
+      <w:r>
+        <w:t xml:space="preserve">Pedro Henrique Gomes Ferreira</w:t>
+      </w:r>
+    </w:p>
+    <w:p>
+      <w:pPr>
+        <w:pStyle w:val="Capa"/>
+      </w:pPr>
+      <w:r>
+        <w:t xml:space="preserve">Carlos Eduardo Rodrigues Ferreira</w:t>
+      </w:r>
+    </w:p>
+    <w:p>
+      <w:pPr>
+        <w:pStyle w:val="Capa"/>
+      </w:pPr>
+      <w:r>
+        <w:t xml:space="preserve">Luan dos Santos Gaspar</w:t>
+      </w:r>
+    </w:p>
+    <w:p>
+      <w:pPr>
+        <w:pStyle w:val="Capa"/>
+      </w:pPr>
+      <w:r>
+        <w:t xml:space="preserve">Francisco Glauber Rodrigues dos Santos</w:t>
+      </w:r>
+    </w:p>
+    <w:p>
+      <w:pPr>
         <w:pStyle w:val="Capatitulo"/>
       </w:pPr>
       <w:r>
-        <w:t xml:space="preserve">Ofuscação da cadeia de pensamento sob supervisão: reanálise de um estudo-piloto e triagem de competência de um estudo prospectivo pré-registrado</w:t>
-      </w:r>
-    </w:p>
-    <w:p>
-      <w:pPr>
-        <w:pStyle w:val="Capa"/>
-      </w:pPr>
-      <w:r>
-        <w:t xml:space="preserve">Kelvin e Silva Marques, Dimitri Farias Fernandes, Hastrorllabyo da Silva Lima, Keven dos Santos Xavier, Caio de Freitas Brandão, Kauan Magalhães Costa, Guilherme Martins Bezerra, Pedro Henrique Gomes Ferreira, Carlos Eduardo Rodrigues Ferreira, Luan dos Santos Gaspar, Francisco Glauber Rodrigues dos Santos</w:t>
-      </w:r>
-    </w:p>
-    <w:p>
-      <w:pPr>
-        <w:pStyle w:val="Capa"/>
-      </w:pPr>
-      <w:r>
-        <w:t xml:space="preserve">Centro Universitário Ateneu, Engenharia da Computação, Fortaleza, 2026</w:t>
+        <w:t xml:space="preserve">Ofuscação da cadeia de pensamento sob supervisão</w:t>
+      </w:r>
+    </w:p>
+    <w:p>
+      <w:pPr>
+        <w:pStyle w:val="Capasubtitulo"/>
+      </w:pPr>
+      <w:r>
+        <w:t xml:space="preserve">reanálise de um estudo-piloto e triagem de competência de um estudo prospectivo pré-registrado</w:t>
+      </w:r>
+    </w:p>
+    <w:p>
+      <w:pPr>
+        <w:pStyle w:val="Capalocal"/>
+      </w:pPr>
+      <w:r>
+        <w:t xml:space="preserve">FORTALEZA</w:t>
+      </w:r>
+      <w:r>
+        <w:br/>
+      </w:r>
+      <w:r>
+        <w:t xml:space="preserve">2026</w:t>
+      </w:r>
+    </w:p>
+    <w:p>
+      <w:r>
+        <w:br w:type="page"/>
       </w:r>
     </w:p>
     <w:bookmarkStart w:id="20" w:name="resumo"/>
@@ -58,7 +181,12 @@
         <w:t xml:space="preserve"> </w:t>
       </w:r>
       <w:r>
-        <w:t xml:space="preserve">cadeia de pensamento; monitorabilidade; pré-registro; triagem de competência; reprodutibilidade.</w:t>
+        <w:t xml:space="preserve">Cadeia de pensamento. Monitorabilidade. Pré-registro. Triagem de competência. Reprodutibilidade.</w:t>
+      </w:r>
+    </w:p>
+    <w:p>
+      <w:r>
+        <w:br w:type="page"/>
       </w:r>
     </w:p>
     <w:bookmarkEnd w:id="20"/>
@@ -94,7 +222,291 @@
         <w:t xml:space="preserve"> </w:t>
       </w:r>
       <w:r>
-        <w:t xml:space="preserve">chain of thought; monitorability; preregistration; competence screening; reproducibility.</w:t>
+        <w:t xml:space="preserve">Chain of thought. Monitorability. Preregistration. Competence screening. Reproducibility.</w:t>
+      </w:r>
+    </w:p>
+    <w:p>
+      <w:r>
+        <w:br w:type="page"/>
+      </w:r>
+    </w:p>
+    <w:p>
+      <w:pPr>
+        <w:pStyle w:val="Titulopretextual"/>
+      </w:pPr>
+      <w:r>
+        <w:t>SUMÁRIO</w:t>
+      </w:r>
+    </w:p>
+    <w:p>
+      <w:pPr>
+        <w:pStyle w:val="Sumario1"/>
+      </w:pPr>
+      <w:r>
+        <w:t xml:space="preserve">1 INTRODUÇÃO</w:t>
+      </w:r>
+      <w:r>
+        <w:tab/>
+      </w:r>
+      <w:r>
+        <w:t>5</w:t>
+      </w:r>
+    </w:p>
+    <w:p>
+      <w:pPr>
+        <w:pStyle w:val="Sumario1"/>
+      </w:pPr>
+      <w:r>
+        <w:t xml:space="preserve">2 FUNDAMENTAÇÃO</w:t>
+      </w:r>
+      <w:r>
+        <w:tab/>
+      </w:r>
+      <w:r>
+        <w:t>5</w:t>
+      </w:r>
+    </w:p>
+    <w:p>
+      <w:pPr>
+        <w:pStyle w:val="Sumario1"/>
+      </w:pPr>
+      <w:r>
+        <w:t xml:space="preserve">3 HIPÓTESES E CATEGORIAS DE EVIDÊNCIA</w:t>
+      </w:r>
+      <w:r>
+        <w:tab/>
+      </w:r>
+      <w:r>
+        <w:t>6</w:t>
+      </w:r>
+    </w:p>
+    <w:p>
+      <w:pPr>
+        <w:pStyle w:val="Sumario1"/>
+      </w:pPr>
+      <w:r>
+        <w:t xml:space="preserve">4 MATERIAIS E MÉTODOS</w:t>
+      </w:r>
+      <w:r>
+        <w:tab/>
+      </w:r>
+      <w:r>
+        <w:t>7</w:t>
+      </w:r>
+    </w:p>
+    <w:p>
+      <w:pPr>
+        <w:pStyle w:val="Sumario2"/>
+      </w:pPr>
+      <w:r>
+        <w:t xml:space="preserve">4.1 Reanálise do estudo-piloto</w:t>
+      </w:r>
+      <w:r>
+        <w:tab/>
+      </w:r>
+      <w:r>
+        <w:t>7</w:t>
+      </w:r>
+    </w:p>
+    <w:p>
+      <w:pPr>
+        <w:pStyle w:val="Sumario2"/>
+      </w:pPr>
+      <w:r>
+        <w:t xml:space="preserve">4.2 Estudo prospectivo v3.2</w:t>
+      </w:r>
+      <w:r>
+        <w:tab/>
+      </w:r>
+      <w:r>
+        <w:t>7</w:t>
+      </w:r>
+    </w:p>
+    <w:p>
+      <w:pPr>
+        <w:pStyle w:val="Sumario2"/>
+      </w:pPr>
+      <w:r>
+        <w:t xml:space="preserve">4.3 Diagnóstico da triagem do v3.2</w:t>
+      </w:r>
+      <w:r>
+        <w:tab/>
+      </w:r>
+      <w:r>
+        <w:t>8</w:t>
+      </w:r>
+    </w:p>
+    <w:p>
+      <w:pPr>
+        <w:pStyle w:val="Sumario2"/>
+      </w:pPr>
+      <w:r>
+        <w:t xml:space="preserve">4.4 Protocolo prospectivo v4</w:t>
+      </w:r>
+      <w:r>
+        <w:tab/>
+      </w:r>
+      <w:r>
+        <w:t>9</w:t>
+      </w:r>
+    </w:p>
+    <w:p>
+      <w:pPr>
+        <w:pStyle w:val="Sumario2"/>
+      </w:pPr>
+      <w:r>
+        <w:t xml:space="preserve">4.5 Verificação de software</w:t>
+      </w:r>
+      <w:r>
+        <w:tab/>
+      </w:r>
+      <w:r>
+        <w:t>10</w:t>
+      </w:r>
+    </w:p>
+    <w:p>
+      <w:pPr>
+        <w:pStyle w:val="Sumario1"/>
+      </w:pPr>
+      <w:r>
+        <w:t xml:space="preserve">5 RESULTADOS</w:t>
+      </w:r>
+      <w:r>
+        <w:tab/>
+      </w:r>
+      <w:r>
+        <w:t>10</w:t>
+      </w:r>
+    </w:p>
+    <w:p>
+      <w:pPr>
+        <w:pStyle w:val="Sumario2"/>
+      </w:pPr>
+      <w:r>
+        <w:t xml:space="preserve">5.1 Reanálise do estudo-piloto</w:t>
+      </w:r>
+      <w:r>
+        <w:tab/>
+      </w:r>
+      <w:r>
+        <w:t>10</w:t>
+      </w:r>
+    </w:p>
+    <w:p>
+      <w:pPr>
+        <w:pStyle w:val="Sumario2"/>
+      </w:pPr>
+      <w:r>
+        <w:t xml:space="preserve">5.2 Triagem do v3.2 e diagnóstico</w:t>
+      </w:r>
+      <w:r>
+        <w:tab/>
+      </w:r>
+      <w:r>
+        <w:t>11</w:t>
+      </w:r>
+    </w:p>
+    <w:p>
+      <w:pPr>
+        <w:pStyle w:val="Sumario2"/>
+      </w:pPr>
+      <w:r>
+        <w:t xml:space="preserve">5.3 Calibração do v4</w:t>
+      </w:r>
+      <w:r>
+        <w:tab/>
+      </w:r>
+      <w:r>
+        <w:t>13</w:t>
+      </w:r>
+    </w:p>
+    <w:p>
+      <w:pPr>
+        <w:pStyle w:val="Sumario2"/>
+      </w:pPr>
+      <w:r>
+        <w:t xml:space="preserve">5.4 Triagem DEV do v4</w:t>
+      </w:r>
+      <w:r>
+        <w:tab/>
+      </w:r>
+      <w:r>
+        <w:t>14</w:t>
+      </w:r>
+    </w:p>
+    <w:p>
+      <w:pPr>
+        <w:pStyle w:val="Sumario2"/>
+      </w:pPr>
+      <w:r>
+        <w:t xml:space="preserve">5.5 Verificações de software</w:t>
+      </w:r>
+      <w:r>
+        <w:tab/>
+      </w:r>
+      <w:r>
+        <w:t>14</w:t>
+      </w:r>
+    </w:p>
+    <w:p>
+      <w:pPr>
+        <w:pStyle w:val="Sumario1"/>
+      </w:pPr>
+      <w:r>
+        <w:t xml:space="preserve">6 DISCUSSÃO</w:t>
+      </w:r>
+      <w:r>
+        <w:tab/>
+      </w:r>
+      <w:r>
+        <w:t>14</w:t>
+      </w:r>
+    </w:p>
+    <w:p>
+      <w:pPr>
+        <w:pStyle w:val="Sumario1"/>
+      </w:pPr>
+      <w:r>
+        <w:t xml:space="preserve">7 LIMITAÇÕES</w:t>
+      </w:r>
+      <w:r>
+        <w:tab/>
+      </w:r>
+      <w:r>
+        <w:t>15</w:t>
+      </w:r>
+    </w:p>
+    <w:p>
+      <w:pPr>
+        <w:pStyle w:val="Sumario1"/>
+      </w:pPr>
+      <w:r>
+        <w:t xml:space="preserve">8 CONCLUSÃO</w:t>
+      </w:r>
+      <w:r>
+        <w:tab/>
+      </w:r>
+      <w:r>
+        <w:t>16</w:t>
+      </w:r>
+    </w:p>
+    <w:p>
+      <w:pPr>
+        <w:pStyle w:val="Sumario1"/>
+      </w:pPr>
+      <w:r>
+        <w:t xml:space="preserve">REFERÊNCIAS</w:t>
+      </w:r>
+      <w:r>
+        <w:tab/>
+      </w:r>
+      <w:r>
+        <w:t>16</w:t>
+      </w:r>
+    </w:p>
+    <w:p>
+      <w:r>
+        <w:br w:type="page"/>
       </w:r>
     </w:p>
     <w:bookmarkEnd w:id="21"/>
@@ -1403,7 +1815,7 @@
         <w:t xml:space="preserve"> </w:t>
       </w:r>
       <w:r>
-        <w:t xml:space="preserve">ou uma saída composta apenas pelo número. No GRPO, o enunciado incluía a nota proibida, e a resposta só era correta no formato exato</w:t>
+        <w:t xml:space="preserve">ou uma saída composta apenas pelo número. No GRPO, o enunciado incluía a nota proibida, e a resposta só era correta com os blocos</w:t>
       </w:r>
       <w:r>
         <w:t xml:space="preserve"> </w:t>
@@ -1412,10 +1824,40 @@
         <w:rPr>
           <w:rStyle w:val="VerbatimChar"/>
         </w:rPr>
-        <w:t xml:space="preserve">&lt;trace&gt;…&lt;/trace&gt;&lt;summary&gt;…&lt;/summary&gt;&lt;answer&gt;LETRA&lt;/answer&gt;</w:t>
-      </w:r>
-      <w:r>
-        <w:t xml:space="preserve">.</w:t>
+        <w:t xml:space="preserve">&lt;trace&gt;</w:t>
+      </w:r>
+      <w:r>
+        <w:t xml:space="preserve">,</w:t>
+      </w:r>
+      <w:r>
+        <w:t xml:space="preserve"> </w:t>
+      </w:r>
+      <w:r>
+        <w:rPr>
+          <w:rStyle w:val="VerbatimChar"/>
+        </w:rPr>
+        <w:t xml:space="preserve">&lt;summary&gt;</w:t>
+      </w:r>
+      <w:r>
+        <w:t xml:space="preserve"> </w:t>
+      </w:r>
+      <w:r>
+        <w:t xml:space="preserve">e</w:t>
+      </w:r>
+      <w:r>
+        <w:t xml:space="preserve"> </w:t>
+      </w:r>
+      <w:r>
+        <w:rPr>
+          <w:rStyle w:val="VerbatimChar"/>
+        </w:rPr>
+        <w:t xml:space="preserve">&lt;answer&gt;</w:t>
+      </w:r>
+      <w:r>
+        <w:t xml:space="preserve"> </w:t>
+      </w:r>
+      <w:r>
+        <w:t xml:space="preserve">em sequência, sem texto entre eles, e a letra do gabarito no último.</w:t>
       </w:r>
     </w:p>
     <w:bookmarkEnd w:id="26"/>
@@ -10087,9 +10529,11 @@
     </w:p>
     <w:bookmarkEnd w:id="43"/>
     <w:sectPr>
-      <w:footerReference r:id="rId9" w:type="default"/>
+      <w:headerReference r:id="rId9" w:type="default"/>
+      <w:footerReference r:id="rId10" w:type="default"/>
       <w:pgSz w:h="16838" w:w="11906"/>
-      <w:pgMar w:bottom="1134" w:footer="567" w:left="1701" w:right="1134" w:top="1701"/>
+      <w:pgMar w:bottom="1134" w:footer="567" w:header="850" w:left="1701" w:right="1134" w:top="1701"/>
+      <w:titlePg/>
     </w:sectPr>
   </w:body>
 </w:document>
@@ -10104,8 +10548,19 @@
   <w:p>
     <w:pPr>
       <w:pStyle w:val="Footer"/>
-      <w:jc w:val="right"/>
+      <w:tabs>
+        <w:tab w:pos="9071" w:val="right"/>
+      </w:tabs>
+      <w:jc w:val="left"/>
     </w:pPr>
+    <w:r>
+      <w:rPr>
+        <w:rFonts w:ascii="Liberation Serif" w:hAnsi="Liberation Serif"/>
+        <w:sz w:val="18"/>
+      </w:rPr>
+      <w:t>Marques et al. | 2026</w:t>
+      <w:tab/>
+    </w:r>
     <w:r>
       <w:rPr>
         <w:rFonts w:ascii="Liberation Serif" w:hAnsi="Liberation Serif"/>
@@ -10136,6 +10591,24 @@
     </w:p>
   </w:footnote>
 </w:footnotes>
+</file>
+
+<file path=word/header1.xml><?xml version="1.0" encoding="utf-8"?>
+<w:hdr xmlns:m="http://schemas.openxmlformats.org/officeDocument/2006/math" xmlns:mc="http://schemas.openxmlformats.org/markup-compatibility/2006" xmlns:mo="http://schemas.microsoft.com/office/mac/office/2008/main" xmlns:mv="urn:schemas-microsoft-com:mac:vml" xmlns:o="urn:schemas-microsoft-com:office:office" xmlns:r="http://schemas.openxmlformats.org/officeDocument/2006/relationships" xmlns:v="urn:schemas-microsoft-com:vml" xmlns:w10="urn:schemas-microsoft-com:office:word" xmlns:w14="http://schemas.microsoft.com/office/word/2010/wordml" xmlns:w="http://schemas.openxmlformats.org/wordprocessingml/2006/main" xmlns:wne="http://schemas.microsoft.com/office/word/2006/wordml" xmlns:wp14="http://schemas.microsoft.com/office/word/2010/wordprocessingDrawing" xmlns:wp="http://schemas.openxmlformats.org/drawingml/2006/wordprocessingDrawing" xmlns:wpc="http://schemas.microsoft.com/office/word/2010/wordprocessingCanvas" xmlns:wpg="http://schemas.microsoft.com/office/word/2010/wordprocessingGroup" xmlns:wpi="http://schemas.microsoft.com/office/word/2010/wordprocessingInk" xmlns:wps="http://schemas.microsoft.com/office/word/2010/wordprocessingShape" mc:Ignorable="w14 wp14">
+  <w:p>
+    <w:pPr>
+      <w:pStyle w:val="Header"/>
+      <w:jc w:val="left"/>
+    </w:pPr>
+    <w:r>
+      <w:rPr>
+        <w:rFonts w:ascii="Liberation Serif" w:hAnsi="Liberation Serif"/>
+        <w:sz w:val="18"/>
+      </w:rPr>
+      <w:t>OFUSCAÇÃO DA CoT SOB SUPERVISÃO | REANÁLISE E TRIAGEM DE COMPETÊNCIA</w:t>
+    </w:r>
+  </w:p>
+</w:hdr>
 </file>
 
 <file path=word/numbering.xml><?xml version="1.0" encoding="utf-8"?>
@@ -10888,7 +11361,7 @@
     <w:pPr>
       <w:keepNext w:val="0"/>
       <w:widowControl/>
-      <w:spacing w:after="160" w:before="360" w:line="288" w:lineRule="auto"/>
+      <w:spacing w:after="160" w:before="2400" w:line="288" w:lineRule="auto"/>
       <w:ind w:firstLine="0"/>
       <w:jc w:val="center"/>
     </w:pPr>
@@ -10897,6 +11370,97 @@
       <w:b/>
       <w:color w:val="000000"/>
       <w:sz w:val="30"/>
+    </w:rPr>
+  </w:style>
+  <w:style w:customStyle="1" w:styleId="Capasubtitulo" w:type="paragraph">
+    <w:name w:val="Capa subtitulo"/>
+    <w:basedOn w:val="Normal"/>
+    <w:pPr>
+      <w:keepNext w:val="0"/>
+      <w:widowControl/>
+      <w:spacing w:after="160" w:before="0" w:line="288" w:lineRule="auto"/>
+      <w:ind w:firstLine="0"/>
+      <w:jc w:val="center"/>
+    </w:pPr>
+    <w:rPr>
+      <w:rFonts w:ascii="Liberation Serif" w:cs="Liberation Serif" w:eastAsia="Liberation Serif" w:hAnsi="Liberation Serif"/>
+      <w:b w:val="0"/>
+      <w:color w:val="000000"/>
+      <w:sz w:val="24"/>
+    </w:rPr>
+  </w:style>
+  <w:style w:customStyle="1" w:styleId="Capalocal" w:type="paragraph">
+    <w:name w:val="Capa local"/>
+    <w:basedOn w:val="Normal"/>
+    <w:pPr>
+      <w:keepNext w:val="0"/>
+      <w:widowControl/>
+      <w:spacing w:after="0" w:before="3800" w:line="312" w:lineRule="auto"/>
+      <w:ind w:firstLine="0"/>
+      <w:jc w:val="center"/>
+    </w:pPr>
+    <w:rPr>
+      <w:rFonts w:ascii="Liberation Serif" w:cs="Liberation Serif" w:eastAsia="Liberation Serif" w:hAnsi="Liberation Serif"/>
+      <w:b w:val="0"/>
+      <w:color w:val="000000"/>
+      <w:sz w:val="22"/>
+    </w:rPr>
+  </w:style>
+  <w:style w:customStyle="1" w:styleId="Titulopretextual" w:type="paragraph">
+    <w:name w:val="Titulo pretextual"/>
+    <w:basedOn w:val="Normal"/>
+    <w:pPr>
+      <w:keepNext w:val="0"/>
+      <w:widowControl/>
+      <w:spacing w:after="240" w:before="0" w:line="276" w:lineRule="auto"/>
+      <w:ind w:firstLine="0"/>
+      <w:jc w:val="center"/>
+    </w:pPr>
+    <w:rPr>
+      <w:rFonts w:ascii="Liberation Serif" w:cs="Liberation Serif" w:eastAsia="Liberation Serif" w:hAnsi="Liberation Serif"/>
+      <w:b/>
+      <w:color w:val="000000"/>
+      <w:sz w:val="24"/>
+    </w:rPr>
+  </w:style>
+  <w:style w:customStyle="1" w:styleId="Sumario1" w:type="paragraph">
+    <w:name w:val="Sumario 1"/>
+    <w:basedOn w:val="Normal"/>
+    <w:pPr>
+      <w:keepNext w:val="0"/>
+      <w:widowControl/>
+      <w:tabs>
+        <w:tab w:leader="dot" w:pos="9071" w:val="right"/>
+      </w:tabs>
+      <w:spacing w:after="40" w:before="120" w:line="288" w:lineRule="auto"/>
+      <w:ind w:firstLine="0" w:left="0"/>
+      <w:jc w:val="left"/>
+    </w:pPr>
+    <w:rPr>
+      <w:rFonts w:ascii="Liberation Serif" w:cs="Liberation Serif" w:eastAsia="Liberation Serif" w:hAnsi="Liberation Serif"/>
+      <w:b/>
+      <w:color w:val="000000"/>
+      <w:sz w:val="22"/>
+    </w:rPr>
+  </w:style>
+  <w:style w:customStyle="1" w:styleId="Sumario2" w:type="paragraph">
+    <w:name w:val="Sumario 2"/>
+    <w:basedOn w:val="Normal"/>
+    <w:pPr>
+      <w:keepNext w:val="0"/>
+      <w:widowControl/>
+      <w:tabs>
+        <w:tab w:leader="dot" w:pos="9071" w:val="right"/>
+      </w:tabs>
+      <w:spacing w:after="40" w:before="0" w:line="288" w:lineRule="auto"/>
+      <w:ind w:firstLine="0" w:left="340"/>
+      <w:jc w:val="left"/>
+    </w:pPr>
+    <w:rPr>
+      <w:rFonts w:ascii="Liberation Serif" w:cs="Liberation Serif" w:eastAsia="Liberation Serif" w:hAnsi="Liberation Serif"/>
+      <w:b w:val="0"/>
+      <w:color w:val="000000"/>
+      <w:sz w:val="22"/>
     </w:rPr>
   </w:style>
   <w:style w:customStyle="1" w:styleId="Resumo" w:type="paragraph">

</xml_diff>